<commit_message>
Correccion y actualizacion al documento del taller practico
</commit_message>
<xml_diff>
--- a/Taller_practtico_Playground.docx
+++ b/Taller_practtico_Playground.docx
@@ -1303,25 +1303,7 @@
           <w:sz w:val="28"/>
           <w:szCs w:val="28"/>
         </w:rPr>
-        <w:t xml:space="preserve">menos de alcanzar las 3mil </w:t>
-      </w:r>
-      <w:proofErr w:type="spellStart"/>
-      <w:r>
-        <w:rPr>
-          <w:rFonts w:ascii="Times New Roman" w:hAnsi="Times New Roman" w:cs="Times New Roman"/>
-          <w:sz w:val="28"/>
-          <w:szCs w:val="28"/>
-        </w:rPr>
-        <w:t>epocas</w:t>
-      </w:r>
-      <w:proofErr w:type="spellEnd"/>
-      <w:r>
-        <w:rPr>
-          <w:rFonts w:ascii="Times New Roman" w:hAnsi="Times New Roman" w:cs="Times New Roman"/>
-          <w:sz w:val="28"/>
-          <w:szCs w:val="28"/>
-        </w:rPr>
-        <w:t>.</w:t>
+        <w:t>menos de alcanzar las 3mil epocas.</w:t>
       </w:r>
     </w:p>
     <w:p>
@@ -2324,6 +2306,102 @@
           <w:szCs w:val="28"/>
         </w:rPr>
       </w:pPr>
+      <w:r>
+        <w:rPr>
+          <w:rFonts w:ascii="Times New Roman" w:hAnsi="Times New Roman" w:cs="Times New Roman"/>
+          <w:sz w:val="28"/>
+          <w:szCs w:val="28"/>
+        </w:rPr>
+        <w:t xml:space="preserve">Por la parte del </w:t>
+      </w:r>
+      <w:r>
+        <w:rPr>
+          <w:rFonts w:ascii="Times New Roman" w:hAnsi="Times New Roman" w:cs="Times New Roman"/>
+          <w:sz w:val="28"/>
+          <w:szCs w:val="28"/>
+        </w:rPr>
+        <w:t>T</w:t>
+      </w:r>
+      <w:r>
+        <w:rPr>
+          <w:rFonts w:ascii="Times New Roman" w:hAnsi="Times New Roman" w:cs="Times New Roman"/>
+          <w:sz w:val="28"/>
+          <w:szCs w:val="28"/>
+        </w:rPr>
+        <w:t xml:space="preserve">est loss </w:t>
+      </w:r>
+      <w:r>
+        <w:rPr>
+          <w:rFonts w:ascii="Times New Roman" w:hAnsi="Times New Roman" w:cs="Times New Roman"/>
+          <w:sz w:val="28"/>
+          <w:szCs w:val="28"/>
+        </w:rPr>
+        <w:t xml:space="preserve">si hay una gran diferencia entre sus valores, algo que le perjudica al momento de valorarla como la mejor solución, pero las demás soluciones </w:t>
+      </w:r>
+      <w:r>
+        <w:rPr>
+          <w:rFonts w:ascii="Times New Roman" w:hAnsi="Times New Roman" w:cs="Times New Roman"/>
+          <w:sz w:val="28"/>
+          <w:szCs w:val="28"/>
+        </w:rPr>
+        <w:t>cuentan con mayor cantidad de puntos negativos en general.</w:t>
+      </w:r>
+    </w:p>
+    <w:p>
+      <w:pPr>
+        <w:rPr>
+          <w:rFonts w:ascii="Times New Roman" w:hAnsi="Times New Roman" w:cs="Times New Roman"/>
+          <w:sz w:val="28"/>
+          <w:szCs w:val="28"/>
+        </w:rPr>
+      </w:pPr>
+    </w:p>
+    <w:p>
+      <w:pPr>
+        <w:rPr>
+          <w:rFonts w:ascii="Times New Roman" w:hAnsi="Times New Roman" w:cs="Times New Roman"/>
+          <w:sz w:val="28"/>
+          <w:szCs w:val="28"/>
+        </w:rPr>
+      </w:pPr>
+    </w:p>
+    <w:p>
+      <w:pPr>
+        <w:pStyle w:val="Ttulo1"/>
+      </w:pPr>
+      <w:r>
+        <w:rPr>
+          <w:b/>
+          <w:bCs/>
+        </w:rPr>
+        <w:lastRenderedPageBreak/>
+        <w:t>Código de la Red</w:t>
+      </w:r>
+      <w:r>
+        <w:rPr>
+          <w:b/>
+          <w:bCs/>
+        </w:rPr>
+        <w:t xml:space="preserve"> Neuronal</w:t>
+      </w:r>
+    </w:p>
+    <w:p>
+      <w:pPr>
+        <w:rPr>
+          <w:rFonts w:ascii="Times New Roman" w:hAnsi="Times New Roman" w:cs="Times New Roman"/>
+          <w:sz w:val="28"/>
+          <w:szCs w:val="28"/>
+        </w:rPr>
+      </w:pPr>
+    </w:p>
+    <w:p>
+      <w:pPr>
+        <w:rPr>
+          <w:rFonts w:ascii="Times New Roman" w:hAnsi="Times New Roman" w:cs="Times New Roman"/>
+          <w:sz w:val="28"/>
+          <w:szCs w:val="28"/>
+        </w:rPr>
+      </w:pPr>
     </w:p>
     <w:p>
       <w:pPr>
@@ -3258,7 +3336,6 @@
           <w:lang w:val="en-US" w:eastAsia="es-CO"/>
           <w14:ligatures w14:val="none"/>
         </w:rPr>
-        <w:lastRenderedPageBreak/>
         <w:t xml:space="preserve">    a2 </w:t>
       </w:r>
       <w:r>
@@ -15559,6 +15636,7 @@
           <w:lang w:val="en-US" w:eastAsia="es-CO"/>
           <w14:ligatures w14:val="none"/>
         </w:rPr>
+        <w:lastRenderedPageBreak/>
         <w:t xml:space="preserve">    </w:t>
       </w:r>
       <w:r>
@@ -15597,7 +15675,6 @@
         </w:rPr>
         <w:t xml:space="preserve"> </w:t>
       </w:r>
-      <w:proofErr w:type="spellStart"/>
       <w:r>
         <w:rPr>
           <w:rFonts w:ascii="Consolas" w:eastAsia="Times New Roman" w:hAnsi="Consolas" w:cs="Courier New"/>
@@ -15610,7 +15687,6 @@
         </w:rPr>
         <w:t>max</w:t>
       </w:r>
-      <w:proofErr w:type="spellEnd"/>
       <w:r>
         <w:rPr>
           <w:rFonts w:ascii="Consolas" w:eastAsia="Times New Roman" w:hAnsi="Consolas" w:cs="Courier New"/>
@@ -16422,46 +16498,32 @@
           <w:lang w:eastAsia="es-CO"/>
           <w14:ligatures w14:val="none"/>
         </w:rPr>
-        <w:t xml:space="preserve"> </w:t>
-      </w:r>
-      <w:proofErr w:type="spellStart"/>
-      <w:r>
-        <w:rPr>
-          <w:rFonts w:ascii="Consolas" w:eastAsia="Times New Roman" w:hAnsi="Consolas" w:cs="Courier New"/>
-          <w:color w:val="000000"/>
+        <w:t xml:space="preserve"> math</w:t>
+      </w:r>
+      <w:r>
+        <w:rPr>
+          <w:rFonts w:ascii="Consolas" w:eastAsia="Times New Roman" w:hAnsi="Consolas" w:cs="Courier New"/>
+          <w:color w:val="999999"/>
           <w:kern w:val="0"/>
           <w:sz w:val="21"/>
           <w:szCs w:val="21"/>
           <w:lang w:eastAsia="es-CO"/>
           <w14:ligatures w14:val="none"/>
         </w:rPr>
-        <w:t>math</w:t>
-      </w:r>
-      <w:r>
-        <w:rPr>
-          <w:rFonts w:ascii="Consolas" w:eastAsia="Times New Roman" w:hAnsi="Consolas" w:cs="Courier New"/>
-          <w:color w:val="999999"/>
+        <w:t>.</w:t>
+      </w:r>
+      <w:r>
+        <w:rPr>
+          <w:rFonts w:ascii="Consolas" w:eastAsia="Times New Roman" w:hAnsi="Consolas" w:cs="Courier New"/>
+          <w:color w:val="000000"/>
           <w:kern w:val="0"/>
           <w:sz w:val="21"/>
           <w:szCs w:val="21"/>
           <w:lang w:eastAsia="es-CO"/>
           <w14:ligatures w14:val="none"/>
         </w:rPr>
-        <w:t>.</w:t>
-      </w:r>
-      <w:r>
-        <w:rPr>
-          <w:rFonts w:ascii="Consolas" w:eastAsia="Times New Roman" w:hAnsi="Consolas" w:cs="Courier New"/>
-          <w:color w:val="000000"/>
-          <w:kern w:val="0"/>
-          <w:sz w:val="21"/>
-          <w:szCs w:val="21"/>
-          <w:lang w:eastAsia="es-CO"/>
-          <w14:ligatures w14:val="none"/>
-        </w:rPr>
         <w:t>tanh</w:t>
       </w:r>
-      <w:proofErr w:type="spellEnd"/>
       <w:r>
         <w:rPr>
           <w:rFonts w:ascii="Consolas" w:eastAsia="Times New Roman" w:hAnsi="Consolas" w:cs="Courier New"/>
@@ -16999,7 +17061,6 @@
         </w:rPr>
         <w:t xml:space="preserve">    </w:t>
       </w:r>
-      <w:proofErr w:type="spellStart"/>
       <w:r>
         <w:rPr>
           <w:rFonts w:ascii="Consolas" w:eastAsia="Times New Roman" w:hAnsi="Consolas" w:cs="Courier New"/>
@@ -17012,7 +17073,6 @@
         </w:rPr>
         <w:t>return</w:t>
       </w:r>
-      <w:proofErr w:type="spellEnd"/>
       <w:r>
         <w:rPr>
           <w:rFonts w:ascii="Consolas" w:eastAsia="Times New Roman" w:hAnsi="Consolas" w:cs="Courier New"/>
@@ -17034,6 +17094,57 @@
           <w:szCs w:val="32"/>
         </w:rPr>
       </w:pPr>
+    </w:p>
+    <w:p>
+      <w:pPr>
+        <w:pStyle w:val="Ttulo1"/>
+      </w:pPr>
+      <w:r>
+        <w:t>Enlace a GitHub</w:t>
+      </w:r>
+    </w:p>
+    <w:p>
+      <w:pPr>
+        <w:rPr>
+          <w:rFonts w:ascii="Times New Roman" w:hAnsi="Times New Roman" w:cs="Times New Roman"/>
+          <w:sz w:val="32"/>
+          <w:szCs w:val="32"/>
+        </w:rPr>
+      </w:pPr>
+    </w:p>
+    <w:p>
+      <w:pPr>
+        <w:rPr>
+          <w:rFonts w:ascii="Times New Roman" w:hAnsi="Times New Roman" w:cs="Times New Roman"/>
+          <w:sz w:val="28"/>
+          <w:szCs w:val="28"/>
+        </w:rPr>
+      </w:pPr>
+      <w:r>
+        <w:rPr>
+          <w:rFonts w:ascii="Times New Roman" w:hAnsi="Times New Roman" w:cs="Times New Roman"/>
+          <w:sz w:val="28"/>
+          <w:szCs w:val="28"/>
+        </w:rPr>
+        <w:t>Enlace a GitHub con los apuntes de la clase y los archivos relacionados con esta actividad:</w:t>
+      </w:r>
+    </w:p>
+    <w:p>
+      <w:pPr>
+        <w:rPr>
+          <w:rFonts w:ascii="Times New Roman" w:hAnsi="Times New Roman" w:cs="Times New Roman"/>
+          <w:sz w:val="32"/>
+          <w:szCs w:val="32"/>
+        </w:rPr>
+      </w:pPr>
+      <w:r>
+        <w:rPr>
+          <w:rFonts w:ascii="Times New Roman" w:hAnsi="Times New Roman" w:cs="Times New Roman"/>
+          <w:sz w:val="32"/>
+          <w:szCs w:val="32"/>
+        </w:rPr>
+        <w:t>https://github.com/Sj-kronton/Apuntes-Ciencia-de-Datos</w:t>
+      </w:r>
     </w:p>
     <w:sectPr>
       <w:pgSz w:w="12240" w:h="15840"/>

</xml_diff>